<commit_message>
Deixa todas as tarefas do modelo da Pizzaria sem ícone de tipo
As 108 tarefas dos 16 diagramas passam a ser tarefa simples, sem o
ícone de manual, usuário, envio ou recebimento no canto superior
esquerdo. Prévias e relatório atualizados.

Co-Authored-By: Claude Opus 5.5 <noreply@anthropic.com>
Claude-Session: https://claude.ai/code/session_01ATUcCfhU2aN9nmNHNJmzf8
</commit_message>
<xml_diff>
--- a/modelagem-pizzaria/Relatorio_Remodelagem_Pizzaria.docx
+++ b/modelagem-pizzaria/Relatorio_Remodelagem_Pizzaria.docx
@@ -3537,7 +3537,7 @@
                 <w:sz w:val="17"/>
                 <w:szCs w:val="17"/>
               </w:rPr>
-              <w:t xml:space="preserve">A mensagem chega no evento de início, e a tarefa passou a ser manual.</w:t>
+              <w:t xml:space="preserve">A mensagem chega no evento de início, e a tarefa deixou de ser de recebimento.</w:t>
             </w:r>
           </w:p>
         </w:tc>
@@ -5598,6 +5598,34 @@
           <w:szCs w:val="21"/>
         </w:rPr>
         <w:t xml:space="preserve"> a tarefa "Ficar de olho na mesa" e o link sem receptor (substituídos pelo gateway baseado em eventos); o XOR "Canal de atendimento?" (substituído pelas duas entradas); o fim "Substituição solicitada" (o processo agora espera a nova entrega); o timer "Fim do expediente" (o último turno encerra o expediente).</w:t>
+      </w:r>
+    </w:p>
+    <w:p>
+      <w:pPr>
+        <w:pStyle w:val="ListParagraph"/>
+        <w:numPr>
+          <w:ilvl w:val="0"/>
+          <w:numId w:val="2"/>
+        </w:numPr>
+        <w:spacing w:after="70" w:line="264"/>
+      </w:pPr>
+      <w:r>
+        <w:rPr>
+          <w:rFonts w:ascii="Arial" w:cs="Arial" w:eastAsia="Arial" w:hAnsi="Arial"/>
+          <w:b/>
+          <w:bCs/>
+          <w:sz w:val="21"/>
+          <w:szCs w:val="21"/>
+        </w:rPr>
+        <w:t xml:space="preserve">Tarefas sem ícone de tipo:</w:t>
+      </w:r>
+      <w:r>
+        <w:rPr>
+          <w:rFonts w:ascii="Arial" w:cs="Arial" w:eastAsia="Arial" w:hAnsi="Arial"/>
+          <w:sz w:val="21"/>
+          <w:szCs w:val="21"/>
+        </w:rPr>
+        <w:t xml:space="preserve"> todas as tarefas ficaram como tarefa simples, sem o ícone de manual, usuário, envio ou recebimento no canto superior esquerdo.</w:t>
       </w:r>
     </w:p>
     <w:p>

</xml_diff>